<commit_message>
need a domain- about to render
</commit_message>
<xml_diff>
--- a/frontend/src/screens/SoftwareChangeReport (1).docx
+++ b/frontend/src/screens/SoftwareChangeReport (1).docx
@@ -497,220 +497,40 @@
         <w:rPr>
           <w:i/>
         </w:rPr>
-        <w:t xml:space="preserve">of the code and doing some thorough searching of the files of the front end. </w:t>
-      </w:r>
-    </w:p>
-    <w:p>
-      <w:pPr>
-        <w:jc w:val="both"/>
-        <w:rPr>
-          <w:i/>
-        </w:rPr>
-      </w:pPr>
-    </w:p>
-    <w:p>
-      <w:pPr>
-        <w:pStyle w:val="ListParagraph"/>
-        <w:numPr>
-          <w:ilvl w:val="0"/>
-          <w:numId w:val="6"/>
-        </w:numPr>
-        <w:ind w:left="360"/>
-        <w:jc w:val="both"/>
-        <w:rPr>
-          <w:i/>
-        </w:rPr>
-      </w:pPr>
-      <w:r>
-        <w:rPr>
-          <w:i/>
-        </w:rPr>
-        <w:t xml:space="preserve"> </w:t>
-      </w:r>
-      <w:r>
-        <w:rPr>
-          <w:i/>
-        </w:rPr>
-        <w:t xml:space="preserve">Using Table 1, list all the files </w:t>
-      </w:r>
-      <w:r>
-        <w:rPr>
-          <w:i/>
-        </w:rPr>
-        <w:t xml:space="preserve">in </w:t>
-      </w:r>
-      <w:r>
-        <w:rPr>
-          <w:i/>
-        </w:rPr>
-        <w:t xml:space="preserve">your </w:t>
-      </w:r>
-      <w:r>
-        <w:rPr>
-          <w:b/>
-          <w:bCs/>
-          <w:i/>
-        </w:rPr>
-        <w:t>Initial Change Set</w:t>
-      </w:r>
-      <w:r>
-        <w:rPr>
-          <w:i/>
-        </w:rPr>
-        <w:t xml:space="preserve"> (set of files </w:t>
-      </w:r>
-      <w:r>
-        <w:rPr>
-          <w:i/>
-        </w:rPr>
-        <w:t>that you believe will need to change to implement your feature</w:t>
-      </w:r>
-      <w:r>
-        <w:rPr>
-          <w:i/>
-        </w:rPr>
-        <w:t xml:space="preserve">). </w:t>
-      </w:r>
-    </w:p>
-    <w:p>
-      <w:pPr>
-        <w:pStyle w:val="ListParagraph"/>
-        <w:ind w:left="360"/>
-        <w:jc w:val="both"/>
-        <w:rPr>
-          <w:i/>
-        </w:rPr>
-      </w:pPr>
-    </w:p>
-    <w:p>
-      <w:pPr>
-        <w:pStyle w:val="ListParagraph"/>
-        <w:ind w:left="360"/>
-        <w:jc w:val="both"/>
-        <w:rPr>
-          <w:i/>
-        </w:rPr>
-      </w:pPr>
-      <w:r>
-        <w:rPr>
-          <w:i/>
-        </w:rPr>
-        <w:t>Explain how you have found each file (</w:t>
-      </w:r>
-      <w:r>
-        <w:rPr>
-          <w:i/>
-        </w:rPr>
-        <w:t>2nd</w:t>
-      </w:r>
-      <w:r>
-        <w:rPr>
-          <w:i/>
-        </w:rPr>
-        <w:t xml:space="preserve"> column). </w:t>
-      </w:r>
-      <w:r>
-        <w:rPr>
-          <w:i/>
-        </w:rPr>
-        <w:t>For example, y</w:t>
-      </w:r>
-      <w:r>
-        <w:rPr>
-          <w:i/>
-        </w:rPr>
-        <w:t xml:space="preserve">ou can </w:t>
-      </w:r>
-      <w:r>
-        <w:rPr>
-          <w:i/>
-        </w:rPr>
-        <w:t xml:space="preserve">use your prior knowledge of the system, </w:t>
-      </w:r>
-      <w:r>
-        <w:rPr>
-          <w:i/>
-        </w:rPr>
-        <w:t>read the source code</w:t>
-      </w:r>
-      <w:r>
-        <w:rPr>
-          <w:i/>
-        </w:rPr>
-        <w:t xml:space="preserve"> for clues</w:t>
-      </w:r>
-      <w:r>
-        <w:rPr>
-          <w:i/>
-        </w:rPr>
-        <w:t xml:space="preserve">, </w:t>
-      </w:r>
-      <w:r>
-        <w:rPr>
-          <w:i/>
-        </w:rPr>
-        <w:t xml:space="preserve">perform a keyword/regular expression </w:t>
-      </w:r>
-      <w:r>
-        <w:rPr>
-          <w:i/>
-        </w:rPr>
-        <w:t>search,</w:t>
-      </w:r>
-      <w:r>
-        <w:rPr>
-          <w:i/>
-        </w:rPr>
-        <w:t xml:space="preserve"> use features provided by</w:t>
-      </w:r>
-      <w:r>
-        <w:rPr>
-          <w:i/>
-        </w:rPr>
-        <w:t xml:space="preserve"> the IDE</w:t>
-      </w:r>
-      <w:r>
-        <w:rPr>
-          <w:i/>
-        </w:rPr>
-        <w:t xml:space="preserve"> (e.g., Open Call Hierarchy, Open Declaration, Open Implementation, References, Debug, Toggle Breakpoint, Find/Replace) or </w:t>
-      </w:r>
-      <w:r>
-        <w:rPr>
-          <w:i/>
-        </w:rPr>
-        <w:t xml:space="preserve">use </w:t>
-      </w:r>
-      <w:r>
-        <w:rPr>
-          <w:i/>
-        </w:rPr>
-        <w:t xml:space="preserve">any other software tools </w:t>
-      </w:r>
-      <w:r>
-        <w:rPr>
-          <w:i/>
-        </w:rPr>
-        <w:t xml:space="preserve">and approaches </w:t>
-      </w:r>
-      <w:r>
-        <w:rPr>
-          <w:i/>
-        </w:rPr>
-        <w:t xml:space="preserve">that </w:t>
-      </w:r>
-      <w:r>
-        <w:rPr>
-          <w:i/>
-        </w:rPr>
-        <w:t>can help you</w:t>
-      </w:r>
-      <w:r>
-        <w:rPr>
-          <w:i/>
-        </w:rPr>
-        <w:t>.</w:t>
-      </w:r>
+        <w:t>of the</w:t>
+      </w:r>
+      <w:r>
+        <w:rPr>
+          <w:i/>
+        </w:rPr>
+        <w:t xml:space="preserve"> source</w:t>
+      </w:r>
+      <w:r>
+        <w:rPr>
+          <w:i/>
+        </w:rPr>
+        <w:t xml:space="preserve"> code and doing some thorough searching of the </w:t>
+      </w:r>
+      <w:r>
+        <w:rPr>
+          <w:i/>
+        </w:rPr>
+        <w:t xml:space="preserve">screens folder in the </w:t>
+      </w:r>
+      <w:r>
+        <w:rPr>
+          <w:i/>
+        </w:rPr>
+        <w:t xml:space="preserve">the front end. </w:t>
+      </w:r>
+    </w:p>
+    <w:p>
+      <w:pPr>
+        <w:jc w:val="both"/>
+        <w:rPr>
+          <w:i/>
+        </w:rPr>
+      </w:pPr>
     </w:p>
     <w:p>
       <w:pPr>
@@ -889,7 +709,13 @@
           </w:tcPr>
           <w:p>
             <w:r>
-              <w:t>I found this file by searching the source code and also knowing since I know the concept is to implement a login system that, the feature will be added here.</w:t>
+              <w:t>I found this file by searching the source code</w:t>
+            </w:r>
+            <w:r>
+              <w:t>. Since I know the concept is to implement a login system, I also know that</w:t>
+            </w:r>
+            <w:r>
+              <w:t xml:space="preserve"> the feature will be added here.</w:t>
             </w:r>
           </w:p>
         </w:tc>
@@ -1020,225 +846,6 @@
           <w:highlight w:val="yellow"/>
         </w:rPr>
         <w:t>Impact Analysis:</w:t>
-      </w:r>
-    </w:p>
-    <w:p>
-      <w:pPr>
-        <w:jc w:val="both"/>
-        <w:rPr>
-          <w:i/>
-        </w:rPr>
-      </w:pPr>
-      <w:r>
-        <w:rPr>
-          <w:i/>
-        </w:rPr>
-        <w:lastRenderedPageBreak/>
-        <w:t>Using T</w:t>
-      </w:r>
-      <w:r>
-        <w:rPr>
-          <w:i/>
-        </w:rPr>
-        <w:t>able 2</w:t>
-      </w:r>
-      <w:r>
-        <w:rPr>
-          <w:i/>
-        </w:rPr>
-        <w:t>,</w:t>
-      </w:r>
-      <w:r>
-        <w:rPr>
-          <w:i/>
-        </w:rPr>
-        <w:t xml:space="preserve"> list</w:t>
-      </w:r>
-      <w:r>
-        <w:rPr>
-          <w:i/>
-        </w:rPr>
-        <w:t xml:space="preserve"> </w:t>
-      </w:r>
-      <w:r>
-        <w:rPr>
-          <w:i/>
-        </w:rPr>
-        <w:t xml:space="preserve">all </w:t>
-      </w:r>
-      <w:r>
-        <w:rPr>
-          <w:i/>
-        </w:rPr>
-        <w:t xml:space="preserve">the </w:t>
-      </w:r>
-      <w:r>
-        <w:rPr>
-          <w:i/>
-        </w:rPr>
-        <w:t xml:space="preserve">other </w:t>
-      </w:r>
-      <w:r>
-        <w:rPr>
-          <w:i/>
-        </w:rPr>
-        <w:t>files</w:t>
-      </w:r>
-      <w:r>
-        <w:rPr>
-          <w:i/>
-        </w:rPr>
-        <w:t xml:space="preserve"> </w:t>
-      </w:r>
-      <w:r>
-        <w:rPr>
-          <w:i/>
-        </w:rPr>
-        <w:t xml:space="preserve">in the source code </w:t>
-      </w:r>
-      <w:r>
-        <w:rPr>
-          <w:i/>
-        </w:rPr>
-        <w:t>that you</w:t>
-      </w:r>
-      <w:r>
-        <w:rPr>
-          <w:i/>
-        </w:rPr>
-        <w:t xml:space="preserve"> </w:t>
-      </w:r>
-      <w:r>
-        <w:rPr>
-          <w:i/>
-        </w:rPr>
-        <w:t xml:space="preserve">identified to be impacted by </w:t>
-      </w:r>
-      <w:r>
-        <w:rPr>
-          <w:i/>
-        </w:rPr>
-        <w:t>your change</w:t>
-      </w:r>
-      <w:r>
-        <w:rPr>
-          <w:b/>
-          <w:i/>
-        </w:rPr>
-        <w:t>.</w:t>
-      </w:r>
-      <w:r>
-        <w:rPr>
-          <w:b/>
-          <w:i/>
-        </w:rPr>
-        <w:t xml:space="preserve"> </w:t>
-      </w:r>
-      <w:r>
-        <w:rPr>
-          <w:bCs/>
-          <w:i/>
-        </w:rPr>
-        <w:t xml:space="preserve">These </w:t>
-      </w:r>
-      <w:r>
-        <w:rPr>
-          <w:bCs/>
-          <w:i/>
-          <w:u w:val="single"/>
-        </w:rPr>
-        <w:t xml:space="preserve">are not the files where your </w:t>
-      </w:r>
-      <w:r>
-        <w:rPr>
-          <w:bCs/>
-          <w:i/>
-          <w:u w:val="single"/>
-        </w:rPr>
-        <w:t>feature</w:t>
-      </w:r>
-      <w:r>
-        <w:rPr>
-          <w:bCs/>
-          <w:i/>
-          <w:u w:val="single"/>
-        </w:rPr>
-        <w:t xml:space="preserve"> is directly implemented</w:t>
-      </w:r>
-      <w:r>
-        <w:rPr>
-          <w:bCs/>
-          <w:i/>
-        </w:rPr>
-        <w:t xml:space="preserve">, but rather </w:t>
-      </w:r>
-      <w:r>
-        <w:rPr>
-          <w:bCs/>
-          <w:i/>
-          <w:u w:val="single"/>
-        </w:rPr>
-        <w:t>other files that may interact in some way with those files where you will implement your feature and would need to be modified as well, in order to propagate the change</w:t>
-      </w:r>
-      <w:r>
-        <w:rPr>
-          <w:i/>
-        </w:rPr>
-        <w:t xml:space="preserve">. </w:t>
-      </w:r>
-      <w:r>
-        <w:rPr>
-          <w:i/>
-        </w:rPr>
-        <w:t xml:space="preserve">Explain how you have found each of the </w:t>
-      </w:r>
-      <w:r>
-        <w:rPr>
-          <w:i/>
-        </w:rPr>
-        <w:t>files</w:t>
-      </w:r>
-      <w:r>
-        <w:rPr>
-          <w:i/>
-        </w:rPr>
-        <w:t>, i.e.</w:t>
-      </w:r>
-      <w:r>
-        <w:rPr>
-          <w:i/>
-        </w:rPr>
-        <w:t>,</w:t>
-      </w:r>
-      <w:r>
-        <w:rPr>
-          <w:i/>
-        </w:rPr>
-        <w:t xml:space="preserve"> which tools </w:t>
-      </w:r>
-      <w:r>
-        <w:rPr>
-          <w:i/>
-        </w:rPr>
-        <w:t xml:space="preserve">or techniques </w:t>
-      </w:r>
-      <w:r>
-        <w:rPr>
-          <w:i/>
-        </w:rPr>
-        <w:t>have you used</w:t>
-      </w:r>
-      <w:r>
-        <w:rPr>
-          <w:i/>
-        </w:rPr>
-        <w:t>.</w:t>
-      </w:r>
-      <w:r>
-        <w:rPr>
-          <w:i/>
-        </w:rPr>
-        <w:t xml:space="preserve"> </w:t>
       </w:r>
     </w:p>
     <w:p>
@@ -1393,13 +1000,33 @@
           <w:tcPr>
             <w:tcW w:w="3181" w:type="dxa"/>
           </w:tcPr>
-          <w:p/>
+          <w:p>
+            <w:r>
+              <w:t>HomeScreen.jsx</w:t>
+            </w:r>
+          </w:p>
         </w:tc>
         <w:tc>
           <w:tcPr>
             <w:tcW w:w="5850" w:type="dxa"/>
           </w:tcPr>
-          <w:p/>
+          <w:p>
+            <w:r>
+              <w:t xml:space="preserve">Since the </w:t>
+            </w:r>
+            <w:r>
+              <w:t>home screen</w:t>
+            </w:r>
+            <w:r>
+              <w:t xml:space="preserve"> is </w:t>
+            </w:r>
+            <w:r>
+              <w:t>where users are directed after signing in successfully works, that is how I identified this page will be impacted by the LoginScreen.jsx change. I used common knowledge</w:t>
+            </w:r>
+            <w:r>
+              <w:t xml:space="preserve"> of the code to understand that.</w:t>
+            </w:r>
+          </w:p>
         </w:tc>
       </w:tr>
       <w:tr>
@@ -2340,9 +1967,7 @@
       <w:pPr>
         <w:jc w:val="both"/>
         <w:rPr>
-          <w:b/>
-          <w:i/>
-          <w:u w:val="single"/>
+          <w:i/>
         </w:rPr>
       </w:pPr>
       <w:r>
@@ -2535,12 +2160,370 @@
         </w:rPr>
         <w:t xml:space="preserve">added code. </w:t>
       </w:r>
-      <w:r>
-        <w:rPr>
-          <w:b/>
-          <w:i/>
+    </w:p>
+    <w:p>
+      <w:pPr>
+        <w:jc w:val="both"/>
+        <w:rPr>
+          <w:i/>
+        </w:rPr>
+      </w:pPr>
+      <w:r>
+        <w:rPr>
+          <w:i/>
+        </w:rPr>
+        <w:t>The file is LoginScreen.jsx –</w:t>
+      </w:r>
+    </w:p>
+    <w:p>
+      <w:pPr>
+        <w:jc w:val="both"/>
+        <w:rPr>
+          <w:i/>
+          <w:highlight w:val="green"/>
+        </w:rPr>
+      </w:pPr>
+      <w:r>
+        <w:rPr>
+          <w:i/>
+          <w:highlight w:val="green"/>
+        </w:rPr>
+        <w:t>import { GoogleOAuthProvider, GoogleLogin } from '@react-oauth/google';</w:t>
+      </w:r>
+    </w:p>
+    <w:p>
+      <w:pPr>
+        <w:jc w:val="both"/>
+        <w:rPr>
+          <w:i/>
+          <w:highlight w:val="green"/>
+        </w:rPr>
+      </w:pPr>
+      <w:r>
+        <w:rPr>
+          <w:i/>
+          <w:highlight w:val="green"/>
+        </w:rPr>
+        <w:t>&lt;GoogleOAuthProviderclientId={process.env.721752547650-qc7881fer2sr835pn9jl16k26fhpu0bm.apps.googleusercontent.com }&gt;</w:t>
+      </w:r>
+    </w:p>
+    <w:p>
+      <w:pPr>
+        <w:jc w:val="both"/>
+        <w:rPr>
+          <w:i/>
+          <w:highlight w:val="green"/>
+        </w:rPr>
+      </w:pPr>
+      <w:r>
+        <w:rPr>
+          <w:i/>
+          <w:highlight w:val="green"/>
+        </w:rPr>
+        <w:t xml:space="preserve">    &lt;FormContainer&gt;</w:t>
+      </w:r>
+    </w:p>
+    <w:p>
+      <w:pPr>
+        <w:jc w:val="both"/>
+        <w:rPr>
+          <w:i/>
+          <w:highlight w:val="green"/>
+        </w:rPr>
+      </w:pPr>
+      <w:r>
+        <w:rPr>
+          <w:i/>
+          <w:highlight w:val="green"/>
+        </w:rPr>
+        <w:t xml:space="preserve">        {/* All existing form elements go here */}</w:t>
+      </w:r>
+    </w:p>
+    <w:p>
+      <w:pPr>
+        <w:jc w:val="both"/>
+        <w:rPr>
+          <w:i/>
+          <w:highlight w:val="green"/>
+        </w:rPr>
+      </w:pPr>
+      <w:r>
+        <w:rPr>
+          <w:i/>
+          <w:highlight w:val="green"/>
+        </w:rPr>
+        <w:t xml:space="preserve">    &lt;/FormContainer&gt;</w:t>
+      </w:r>
+    </w:p>
+    <w:p>
+      <w:pPr>
+        <w:jc w:val="both"/>
+        <w:rPr>
+          <w:i/>
+          <w:highlight w:val="green"/>
+        </w:rPr>
+      </w:pPr>
+      <w:r>
+        <w:rPr>
+          <w:i/>
+          <w:highlight w:val="green"/>
+        </w:rPr>
+        <w:t>&lt;/GoogleOAuthProvider&gt;</w:t>
+      </w:r>
+    </w:p>
+    <w:p>
+      <w:pPr>
+        <w:jc w:val="both"/>
+        <w:rPr>
+          <w:i/>
+          <w:highlight w:val="green"/>
+        </w:rPr>
+      </w:pPr>
+      <w:r>
+        <w:rPr>
+          <w:i/>
+          <w:highlight w:val="green"/>
+        </w:rPr>
+        <w:t>&lt;GoogleLogin</w:t>
+      </w:r>
+    </w:p>
+    <w:p>
+      <w:pPr>
+        <w:jc w:val="both"/>
+        <w:rPr>
+          <w:i/>
+          <w:highlight w:val="green"/>
+        </w:rPr>
+      </w:pPr>
+      <w:r>
+        <w:rPr>
+          <w:i/>
+          <w:highlight w:val="green"/>
+        </w:rPr>
+        <w:t xml:space="preserve">    onSuccess={handleGoogleSuccess}</w:t>
+      </w:r>
+    </w:p>
+    <w:p>
+      <w:pPr>
+        <w:jc w:val="both"/>
+        <w:rPr>
+          <w:i/>
+          <w:highlight w:val="green"/>
+        </w:rPr>
+      </w:pPr>
+      <w:r>
+        <w:rPr>
+          <w:i/>
+          <w:highlight w:val="green"/>
+        </w:rPr>
+        <w:t xml:space="preserve">    onError={handleGoogleFailure}</w:t>
+      </w:r>
+    </w:p>
+    <w:p>
+      <w:pPr>
+        <w:jc w:val="both"/>
+        <w:rPr>
+          <w:i/>
+          <w:highlight w:val="green"/>
+        </w:rPr>
+      </w:pPr>
+      <w:r>
+        <w:rPr>
+          <w:i/>
+          <w:highlight w:val="green"/>
+        </w:rPr>
+        <w:t xml:space="preserve">    buttonText="Sign in with Google"</w:t>
+      </w:r>
+    </w:p>
+    <w:p>
+      <w:pPr>
+        <w:jc w:val="both"/>
+        <w:rPr>
+          <w:i/>
+          <w:highlight w:val="green"/>
+        </w:rPr>
+      </w:pPr>
+      <w:r>
+        <w:rPr>
+          <w:i/>
+          <w:highlight w:val="green"/>
         </w:rPr>
         <w:lastRenderedPageBreak/>
+        <w:t>/&gt;</w:t>
+      </w:r>
+    </w:p>
+    <w:p>
+      <w:pPr>
+        <w:jc w:val="both"/>
+        <w:rPr>
+          <w:i/>
+          <w:highlight w:val="green"/>
+        </w:rPr>
+      </w:pPr>
+      <w:r>
+        <w:rPr>
+          <w:i/>
+          <w:highlight w:val="green"/>
+        </w:rPr>
+        <w:t>const handleGoogleSuccess = (credentialResponse) =&gt; {</w:t>
+      </w:r>
+    </w:p>
+    <w:p>
+      <w:pPr>
+        <w:jc w:val="both"/>
+        <w:rPr>
+          <w:i/>
+          <w:highlight w:val="green"/>
+        </w:rPr>
+      </w:pPr>
+      <w:r>
+        <w:rPr>
+          <w:i/>
+          <w:highlight w:val="green"/>
+        </w:rPr>
+        <w:t xml:space="preserve">    console.log("Google Credential:", credentialResponse);</w:t>
+      </w:r>
+    </w:p>
+    <w:p>
+      <w:pPr>
+        <w:jc w:val="both"/>
+        <w:rPr>
+          <w:i/>
+          <w:highlight w:val="green"/>
+        </w:rPr>
+      </w:pPr>
+      <w:r>
+        <w:rPr>
+          <w:i/>
+          <w:highlight w:val="green"/>
+        </w:rPr>
+        <w:t xml:space="preserve">    toast.success("Logged in with Google!");</w:t>
+      </w:r>
+    </w:p>
+    <w:p>
+      <w:pPr>
+        <w:jc w:val="both"/>
+        <w:rPr>
+          <w:i/>
+          <w:highlight w:val="green"/>
+        </w:rPr>
+      </w:pPr>
+      <w:r>
+        <w:rPr>
+          <w:i/>
+          <w:highlight w:val="green"/>
+        </w:rPr>
+        <w:t xml:space="preserve">    navigate(redirect);</w:t>
+      </w:r>
+    </w:p>
+    <w:p>
+      <w:pPr>
+        <w:jc w:val="both"/>
+        <w:rPr>
+          <w:i/>
+          <w:highlight w:val="green"/>
+        </w:rPr>
+      </w:pPr>
+      <w:r>
+        <w:rPr>
+          <w:i/>
+          <w:highlight w:val="green"/>
+        </w:rPr>
+        <w:t>};</w:t>
+      </w:r>
+    </w:p>
+    <w:p>
+      <w:pPr>
+        <w:jc w:val="both"/>
+        <w:rPr>
+          <w:i/>
+          <w:highlight w:val="green"/>
+        </w:rPr>
+      </w:pPr>
+    </w:p>
+    <w:p>
+      <w:pPr>
+        <w:jc w:val="both"/>
+        <w:rPr>
+          <w:i/>
+          <w:highlight w:val="green"/>
+        </w:rPr>
+      </w:pPr>
+      <w:r>
+        <w:rPr>
+          <w:i/>
+          <w:highlight w:val="green"/>
+        </w:rPr>
+        <w:t>const handleGoogleFailure = (error) =&gt; {</w:t>
+      </w:r>
+    </w:p>
+    <w:p>
+      <w:pPr>
+        <w:jc w:val="both"/>
+        <w:rPr>
+          <w:i/>
+          <w:highlight w:val="green"/>
+        </w:rPr>
+      </w:pPr>
+      <w:r>
+        <w:rPr>
+          <w:i/>
+          <w:highlight w:val="green"/>
+        </w:rPr>
+        <w:t xml:space="preserve">    console.error("Google Login Failed:", error);</w:t>
+      </w:r>
+    </w:p>
+    <w:p>
+      <w:pPr>
+        <w:jc w:val="both"/>
+        <w:rPr>
+          <w:i/>
+        </w:rPr>
+      </w:pPr>
+      <w:r>
+        <w:rPr>
+          <w:i/>
+          <w:highlight w:val="green"/>
+        </w:rPr>
+        <w:t xml:space="preserve">    toast.error("Google login failed. Please try again.");</w:t>
+      </w:r>
+    </w:p>
+    <w:p>
+      <w:pPr>
+        <w:jc w:val="both"/>
+        <w:rPr>
+          <w:i/>
+        </w:rPr>
+      </w:pPr>
+      <w:r>
+        <w:rPr>
+          <w:i/>
+        </w:rPr>
+        <w:t>};</w:t>
+      </w:r>
+    </w:p>
+    <w:p>
+      <w:pPr>
+        <w:jc w:val="both"/>
+        <w:rPr>
+          <w:i/>
+        </w:rPr>
+      </w:pPr>
+    </w:p>
+    <w:p>
+      <w:pPr>
+        <w:jc w:val="both"/>
+        <w:rPr>
+          <w:b/>
+          <w:i/>
+          <w:u w:val="single"/>
+        </w:rPr>
+      </w:pPr>
+      <w:r>
+        <w:rPr>
+          <w:b/>
+          <w:i/>
+        </w:rPr>
         <w:t xml:space="preserve">Also, </w:t>
       </w:r>
       <w:r>

</xml_diff>